<commit_message>
Rewrite CV: add E-GATE, FlyNet, OrphanGuard, smog dashboard and the patent
The CV was two months stale and omitted five shipped projects entirely,
including E-GATE (5,562 students) and the filed provisional patent — the
two strongest credentials on it.

Reordered by impact with E-GATE leading. FaceTrace is folded into
SmartAttend since it is that system's recognition engine rather than a
separate project, and LGU Gatepass is cut as it overlaps the campus-access
story E-GATE now tells. Skills gain PyTorch, SNN, RL, Node/Express,
WebSocket and CUDA; contact line gains LinkedIn and the portfolio URL;
semester corrected to 3rd.

Styling is unchanged — paragraphs are rebuilt with the document's existing
direct-formatting runs. The PDF export is still the August version and
needs regenerating from Word.

Co-Authored-By: Claude Opus 5 <noreply@anthropic.com>
</commit_message>
<xml_diff>
--- a/Zaryab_Malik_CV.docx
+++ b/Zaryab_Malik_CV.docx
@@ -21,6 +21,21 @@
     </w:p>
     <w:p>
       <w:pPr>
+        <w:spacing w:after="14"/>
+        <w:jc w:val="center"/>
+      </w:pPr>
+      <w:r>
+        <w:rPr>
+          <w:rFonts w:ascii="Calibri" w:cs="Calibri" w:eastAsia="Calibri" w:hAnsi="Calibri"/>
+          <w:color w:val="888888"/>
+          <w:sz w:val="18"/>
+          <w:szCs w:val="18"/>
+        </w:rPr>
+        <w:t xml:space="preserve">Lahore, PK  ·  zaryabmalik314@gmail.com  ·  0312-9082747</w:t>
+      </w:r>
+    </w:p>
+    <w:p>
+      <w:pPr>
         <w:spacing w:after="50"/>
         <w:jc w:val="center"/>
       </w:pPr>
@@ -31,7 +46,7 @@
           <w:sz w:val="18"/>
           <w:szCs w:val="18"/>
         </w:rPr>
-        <w:t xml:space="preserve">Lahore, PK  ·  zaryabmalik314@gmail.com  ·  0312-9082747  ·  github.com/zaryabmalik314-code</w:t>
+        <w:t xml:space="preserve">github.com/zaryabmalik314-code  ·  linkedin.com/in/zaryabmalik314  ·  zaryabmalik314-code.github.io/PERSONAL-PORTFOLIO</w:t>
       </w:r>
     </w:p>
     <w:p>
@@ -53,7 +68,7 @@
           <w:sz w:val="20"/>
           <w:szCs w:val="20"/>
         </w:rPr>
-        <w:t xml:space="preserve">AI developer shipping production systems at Lahore Garrison University — 7+ solo-built apps (attendance, chatbots, computer vision) serving hundreds of real users. Also a freelance packaging &amp; brand designer with 50+ delivered projects on Fiverr.</w:t>
+        <w:t xml:space="preserve">AI/ML engineer shipping production systems at Lahore Garrison University — provisional patent filed for a biometric attendance platform, 14+ solo-built systems in deployment, and a spiking neural network trained on a real Drosophila brain connectome. Also a freelance packaging &amp; brand designer with 50+ delivered projects on Fiverr.</w:t>
       </w:r>
     </w:p>
     <w:p>
@@ -102,7 +117,7 @@
           <w:sz w:val="20"/>
           <w:szCs w:val="20"/>
         </w:rPr>
-        <w:t xml:space="preserve">RAG, InsightFace, ArcFace, MediaPipe, ChromaDB, FAISS, Groq, Gemini, SentenceTransformers, Prompt Engineering</w:t>
+        <w:t xml:space="preserve">PyTorch, Spiking Neural Networks, Reinforcement Learning (PPO), RAG, InsightFace, ArcFace, MediaPipe, ChromaDB, FAISS, Groq, Gemini, SentenceTransformers</w:t>
       </w:r>
     </w:p>
     <w:p>
@@ -127,7 +142,7 @@
           <w:sz w:val="20"/>
           <w:szCs w:val="20"/>
         </w:rPr>
-        <w:t xml:space="preserve">Python, JavaScript, FastAPI, PostgreSQL, Firebase, SQLite, HTML/CSS, C++</w:t>
+        <w:t xml:space="preserve">Python, JavaScript, FastAPI, Node.js, Express, Next.js, PostgreSQL, WebSocket, Firebase, SQLite, HTML/CSS, C++</w:t>
       </w:r>
     </w:p>
     <w:p>
@@ -152,7 +167,7 @@
           <w:sz w:val="20"/>
           <w:szCs w:val="20"/>
         </w:rPr>
-        <w:t xml:space="preserve">Railway, Netlify, GitHub Pages, Android TWA/PWA, Docker</w:t>
+        <w:t xml:space="preserve">Railway, Netlify, GitHub Pages, Android TWA/PWA, Docker, CUDA</w:t>
       </w:r>
     </w:p>
     <w:p>
@@ -217,7 +232,7 @@
           <w:sz w:val="21"/>
           <w:szCs w:val="21"/>
         </w:rPr>
-        <w:t xml:space="preserve">SmartAttend — AI Attendance System</w:t>
+        <w:t xml:space="preserve">E-GATE — RFID Campus Access Control</w:t>
       </w:r>
       <w:r>
         <w:rPr>
@@ -232,28 +247,19 @@
           <w:rFonts w:ascii="Calibri" w:cs="Calibri" w:eastAsia="Calibri" w:hAnsi="Calibri"/>
           <w:b/>
           <w:bCs/>
-          <w:color w:val="0077b6"/>
-          <w:sz w:val="18"/>
-          <w:szCs w:val="18"/>
-        </w:rPr>
-        <w:t xml:space="preserve">[Testing]</w:t>
-      </w:r>
-    </w:p>
-    <w:p>
-      <w:pPr>
-        <w:spacing w:after="10" w:before="10"/>
-        <w:ind w:left="280"/>
-      </w:pPr>
-      <w:r>
-        <w:rPr>
-          <w:rFonts w:ascii="Calibri" w:cs="Calibri" w:eastAsia="Calibri" w:hAnsi="Calibri"/>
-          <w:b/>
-          <w:bCs/>
-          <w:color w:val="888888"/>
-          <w:sz w:val="18"/>
-          <w:szCs w:val="18"/>
-        </w:rPr>
-        <w:t xml:space="preserve">Stack: </w:t>
+          <w:color w:val="2d6a4f"/>
+          <w:sz w:val="18"/>
+          <w:szCs w:val="18"/>
+        </w:rPr>
+        <w:t xml:space="preserve">[Live]</w:t>
+      </w:r>
+      <w:r>
+        <w:rPr>
+          <w:rFonts w:ascii="Calibri" w:cs="Calibri" w:eastAsia="Calibri" w:hAnsi="Calibri"/>
+          <w:sz w:val="18"/>
+          <w:szCs w:val="18"/>
+        </w:rPr>
+        <w:t xml:space="preserve">   </w:t>
       </w:r>
       <w:r>
         <w:rPr>
@@ -261,150 +267,178 @@
           <w:i/>
           <w:iCs/>
           <w:color w:val="888888"/>
-          <w:sz w:val="18"/>
-          <w:szCs w:val="18"/>
-        </w:rPr>
-        <w:t xml:space="preserve">InsightFace, FastAPI, PostgreSQL, Android TWA</w:t>
-      </w:r>
-    </w:p>
-    <w:p>
-      <w:pPr>
-        <w:spacing w:after="20" w:before="20"/>
-        <w:ind w:left="280"/>
-      </w:pPr>
-      <w:r>
-        <w:rPr>
-          <w:rFonts w:ascii="Calibri" w:cs="Calibri" w:eastAsia="Calibri" w:hAnsi="Calibri"/>
-          <w:color w:val="2d6a4f"/>
-          <w:sz w:val="20"/>
-          <w:szCs w:val="20"/>
-        </w:rPr>
-        <w:t xml:space="preserve">•  </w:t>
-      </w:r>
-      <w:r>
-        <w:rPr>
-          <w:rFonts w:ascii="Calibri" w:cs="Calibri" w:eastAsia="Calibri" w:hAnsi="Calibri"/>
-          <w:b/>
-          <w:bCs/>
-          <w:color w:val="1a1a1a"/>
-          <w:sz w:val="20"/>
-          <w:szCs w:val="20"/>
-        </w:rPr>
-        <w:t xml:space="preserve">Production system </w:t>
-      </w:r>
-      <w:r>
-        <w:rPr>
-          <w:rFonts w:ascii="Calibri" w:cs="Calibri" w:eastAsia="Calibri" w:hAnsi="Calibri"/>
-          <w:color w:val="333333"/>
-          <w:sz w:val="20"/>
-          <w:szCs w:val="20"/>
-        </w:rPr>
-        <w:t xml:space="preserve">— Deployed in LGU Maths Department for ~400 faculty</w:t>
-      </w:r>
-    </w:p>
-    <w:p>
-      <w:pPr>
-        <w:spacing w:after="20" w:before="20"/>
-        <w:ind w:left="280"/>
-      </w:pPr>
-      <w:r>
-        <w:rPr>
-          <w:rFonts w:ascii="Calibri" w:cs="Calibri" w:eastAsia="Calibri" w:hAnsi="Calibri"/>
-          <w:color w:val="2d6a4f"/>
-          <w:sz w:val="20"/>
-          <w:szCs w:val="20"/>
-        </w:rPr>
-        <w:t xml:space="preserve">•  </w:t>
-      </w:r>
-      <w:r>
-        <w:rPr>
-          <w:rFonts w:ascii="Calibri" w:cs="Calibri" w:eastAsia="Calibri" w:hAnsi="Calibri"/>
-          <w:b/>
-          <w:bCs/>
-          <w:color w:val="1a1a1a"/>
-          <w:sz w:val="20"/>
-          <w:szCs w:val="20"/>
-        </w:rPr>
-        <w:t xml:space="preserve">InsightFace-powered </w:t>
-      </w:r>
-      <w:r>
-        <w:rPr>
-          <w:rFonts w:ascii="Calibri" w:cs="Calibri" w:eastAsia="Calibri" w:hAnsi="Calibri"/>
-          <w:color w:val="333333"/>
-          <w:sz w:val="20"/>
-          <w:szCs w:val="20"/>
-        </w:rPr>
-        <w:t xml:space="preserve">— face recognition with multi-angle enrollment under real campus conditions</w:t>
-      </w:r>
-    </w:p>
-    <w:p>
-      <w:pPr>
-        <w:spacing w:after="20" w:before="20"/>
-        <w:ind w:left="280"/>
-      </w:pPr>
-      <w:r>
-        <w:rPr>
-          <w:rFonts w:ascii="Calibri" w:cs="Calibri" w:eastAsia="Calibri" w:hAnsi="Calibri"/>
-          <w:color w:val="2d6a4f"/>
-          <w:sz w:val="20"/>
-          <w:szCs w:val="20"/>
-        </w:rPr>
-        <w:t xml:space="preserve">•  </w:t>
-      </w:r>
-      <w:r>
-        <w:rPr>
-          <w:rFonts w:ascii="Calibri" w:cs="Calibri" w:eastAsia="Calibri" w:hAnsi="Calibri"/>
-          <w:b/>
-          <w:bCs/>
-          <w:color w:val="1a1a1a"/>
-          <w:sz w:val="20"/>
-          <w:szCs w:val="20"/>
-        </w:rPr>
-        <w:t xml:space="preserve">Semester management </w:t>
-      </w:r>
-      <w:r>
-        <w:rPr>
-          <w:rFonts w:ascii="Calibri" w:cs="Calibri" w:eastAsia="Calibri" w:hAnsi="Calibri"/>
-          <w:color w:val="333333"/>
-          <w:sz w:val="20"/>
-          <w:szCs w:val="20"/>
-        </w:rPr>
-        <w:t xml:space="preserve">— create semesters, assign courses, track per-subject attendance, export reports</w:t>
-      </w:r>
-    </w:p>
-    <w:p>
-      <w:pPr>
-        <w:spacing w:after="20" w:before="20"/>
-        <w:ind w:left="280"/>
-      </w:pPr>
-      <w:r>
-        <w:rPr>
-          <w:rFonts w:ascii="Calibri" w:cs="Calibri" w:eastAsia="Calibri" w:hAnsi="Calibri"/>
-          <w:color w:val="2d6a4f"/>
-          <w:sz w:val="20"/>
-          <w:szCs w:val="20"/>
-        </w:rPr>
-        <w:t xml:space="preserve">•  </w:t>
-      </w:r>
-      <w:r>
-        <w:rPr>
-          <w:rFonts w:ascii="Calibri" w:cs="Calibri" w:eastAsia="Calibri" w:hAnsi="Calibri"/>
-          <w:b/>
-          <w:bCs/>
-          <w:color w:val="1a1a1a"/>
-          <w:sz w:val="20"/>
-          <w:szCs w:val="20"/>
-        </w:rPr>
-        <w:t xml:space="preserve">HOD/Admin dashboards </w:t>
-      </w:r>
-      <w:r>
-        <w:rPr>
-          <w:rFonts w:ascii="Calibri" w:cs="Calibri" w:eastAsia="Calibri" w:hAnsi="Calibri"/>
-          <w:color w:val="333333"/>
-          <w:sz w:val="20"/>
-          <w:szCs w:val="20"/>
-        </w:rPr>
-        <w:t xml:space="preserve">— with department analytics, attendance rates, late arrivals, real-time activity log</w:t>
+          <w:sz w:val="17"/>
+          <w:szCs w:val="17"/>
+        </w:rPr>
+        <w:t xml:space="preserve">gate-api-production-b712.up.railway.app</w:t>
+      </w:r>
+    </w:p>
+    <w:p>
+      <w:pPr>
+        <w:spacing w:after="10" w:before="10"/>
+        <w:ind w:left="280"/>
+      </w:pPr>
+      <w:r>
+        <w:rPr>
+          <w:rFonts w:ascii="Calibri" w:cs="Calibri" w:eastAsia="Calibri" w:hAnsi="Calibri"/>
+          <w:b/>
+          <w:bCs/>
+          <w:color w:val="888888"/>
+          <w:sz w:val="18"/>
+          <w:szCs w:val="18"/>
+        </w:rPr>
+        <w:t xml:space="preserve">Stack: </w:t>
+      </w:r>
+      <w:r>
+        <w:rPr>
+          <w:rFonts w:ascii="Calibri" w:cs="Calibri" w:eastAsia="Calibri" w:hAnsi="Calibri"/>
+          <w:i/>
+          <w:iCs/>
+          <w:color w:val="888888"/>
+          <w:sz w:val="18"/>
+          <w:szCs w:val="18"/>
+        </w:rPr>
+        <w:t xml:space="preserve">Node.js, Express, PostgreSQL, WebSocket, XLSX</w:t>
+      </w:r>
+    </w:p>
+    <w:p>
+      <w:pPr>
+        <w:spacing w:after="20" w:before="20"/>
+        <w:ind w:left="280"/>
+      </w:pPr>
+      <w:r>
+        <w:rPr>
+          <w:rFonts w:ascii="Calibri" w:cs="Calibri" w:eastAsia="Calibri" w:hAnsi="Calibri"/>
+          <w:color w:val="2d6a4f"/>
+          <w:sz w:val="20"/>
+          <w:szCs w:val="20"/>
+        </w:rPr>
+        <w:t xml:space="preserve">•  </w:t>
+      </w:r>
+      <w:r>
+        <w:rPr>
+          <w:rFonts w:ascii="Calibri" w:cs="Calibri" w:eastAsia="Calibri" w:hAnsi="Calibri"/>
+          <w:b/>
+          <w:bCs/>
+          <w:color w:val="1a1a1a"/>
+          <w:sz w:val="20"/>
+          <w:szCs w:val="20"/>
+        </w:rPr>
+        <w:t xml:space="preserve">Deployed at scale </w:t>
+      </w:r>
+      <w:r>
+        <w:rPr>
+          <w:rFonts w:ascii="Calibri" w:cs="Calibri" w:eastAsia="Calibri" w:hAnsi="Calibri"/>
+          <w:color w:val="333333"/>
+          <w:sz w:val="20"/>
+          <w:szCs w:val="20"/>
+        </w:rPr>
+        <w:t xml:space="preserve">— RFID verification at two LGU campus gates against a 5,562-student registry</w:t>
+      </w:r>
+    </w:p>
+    <w:p>
+      <w:pPr>
+        <w:spacing w:after="20" w:before="20"/>
+        <w:ind w:left="280"/>
+      </w:pPr>
+      <w:r>
+        <w:rPr>
+          <w:rFonts w:ascii="Calibri" w:cs="Calibri" w:eastAsia="Calibri" w:hAnsi="Calibri"/>
+          <w:color w:val="2d6a4f"/>
+          <w:sz w:val="20"/>
+          <w:szCs w:val="20"/>
+        </w:rPr>
+        <w:t xml:space="preserve">•  </w:t>
+      </w:r>
+      <w:r>
+        <w:rPr>
+          <w:rFonts w:ascii="Calibri" w:cs="Calibri" w:eastAsia="Calibri" w:hAnsi="Calibri"/>
+          <w:b/>
+          <w:bCs/>
+          <w:color w:val="1a1a1a"/>
+          <w:sz w:val="20"/>
+          <w:szCs w:val="20"/>
+        </w:rPr>
+        <w:t xml:space="preserve">Bulk enrollment pipeline </w:t>
+      </w:r>
+      <w:r>
+        <w:rPr>
+          <w:rFonts w:ascii="Calibri" w:cs="Calibri" w:eastAsia="Calibri" w:hAnsi="Calibri"/>
+          <w:color w:val="333333"/>
+          <w:sz w:val="20"/>
+          <w:szCs w:val="20"/>
+        </w:rPr>
+        <w:t xml:space="preserve">— institutional Excel ingested to PostgreSQL, card UIDs bound per student by the registration team</w:t>
+      </w:r>
+    </w:p>
+    <w:p>
+      <w:pPr>
+        <w:spacing w:after="20" w:before="20"/>
+        <w:ind w:left="280"/>
+      </w:pPr>
+      <w:r>
+        <w:rPr>
+          <w:rFonts w:ascii="Calibri" w:cs="Calibri" w:eastAsia="Calibri" w:hAnsi="Calibri"/>
+          <w:color w:val="2d6a4f"/>
+          <w:sz w:val="20"/>
+          <w:szCs w:val="20"/>
+        </w:rPr>
+        <w:t xml:space="preserve">•  </w:t>
+      </w:r>
+      <w:r>
+        <w:rPr>
+          <w:rFonts w:ascii="Calibri" w:cs="Calibri" w:eastAsia="Calibri" w:hAnsi="Calibri"/>
+          <w:b/>
+          <w:bCs/>
+          <w:color w:val="1a1a1a"/>
+          <w:sz w:val="20"/>
+          <w:szCs w:val="20"/>
+        </w:rPr>
+        <w:t xml:space="preserve">Dual input path </w:t>
+      </w:r>
+      <w:r>
+        <w:rPr>
+          <w:rFonts w:ascii="Calibri" w:cs="Calibri" w:eastAsia="Calibri" w:hAnsi="Calibri"/>
+          <w:color w:val="333333"/>
+          <w:sz w:val="20"/>
+          <w:szCs w:val="20"/>
+        </w:rPr>
+        <w:t xml:space="preserve">— RFID card tap plus an AIT AiFace biometric terminal integrated at Gate 4</w:t>
+      </w:r>
+    </w:p>
+    <w:p>
+      <w:pPr>
+        <w:spacing w:after="20" w:before="20"/>
+        <w:ind w:left="280"/>
+      </w:pPr>
+      <w:r>
+        <w:rPr>
+          <w:rFonts w:ascii="Calibri" w:cs="Calibri" w:eastAsia="Calibri" w:hAnsi="Calibri"/>
+          <w:color w:val="2d6a4f"/>
+          <w:sz w:val="20"/>
+          <w:szCs w:val="20"/>
+        </w:rPr>
+        <w:t xml:space="preserve">•  </w:t>
+      </w:r>
+      <w:r>
+        <w:rPr>
+          <w:rFonts w:ascii="Calibri" w:cs="Calibri" w:eastAsia="Calibri" w:hAnsi="Calibri"/>
+          <w:b/>
+          <w:bCs/>
+          <w:color w:val="1a1a1a"/>
+          <w:sz w:val="20"/>
+          <w:szCs w:val="20"/>
+        </w:rPr>
+        <w:t xml:space="preserve">Live command center </w:t>
+      </w:r>
+      <w:r>
+        <w:rPr>
+          <w:rFonts w:ascii="Calibri" w:cs="Calibri" w:eastAsia="Calibri" w:hAnsi="Calibri"/>
+          <w:color w:val="333333"/>
+          <w:sz w:val="20"/>
+          <w:szCs w:val="20"/>
+        </w:rPr>
+        <w:t xml:space="preserve">— WebSocket feed streaming entry/exit events, occupancy, and per-gate analytics</w:t>
       </w:r>
     </w:p>
     <w:p>
@@ -420,7 +454,7 @@
           <w:sz w:val="21"/>
           <w:szCs w:val="21"/>
         </w:rPr>
-        <w:t xml:space="preserve">LGU Admissions Chatbot</w:t>
+        <w:t xml:space="preserve">SmartAttend — AI Attendance System</w:t>
       </w:r>
       <w:r>
         <w:rPr>
@@ -435,19 +469,28 @@
           <w:rFonts w:ascii="Calibri" w:cs="Calibri" w:eastAsia="Calibri" w:hAnsi="Calibri"/>
           <w:b/>
           <w:bCs/>
-          <w:color w:val="2d6a4f"/>
-          <w:sz w:val="18"/>
-          <w:szCs w:val="18"/>
-        </w:rPr>
-        <w:t xml:space="preserve">[Live]</w:t>
-      </w:r>
-      <w:r>
-        <w:rPr>
-          <w:rFonts w:ascii="Calibri" w:cs="Calibri" w:eastAsia="Calibri" w:hAnsi="Calibri"/>
-          <w:sz w:val="18"/>
-          <w:szCs w:val="18"/>
-        </w:rPr>
-        <w:t xml:space="preserve">   </w:t>
+          <w:color w:val="0077b6"/>
+          <w:sz w:val="18"/>
+          <w:szCs w:val="18"/>
+        </w:rPr>
+        <w:t xml:space="preserve">[Patent Filed]</w:t>
+      </w:r>
+    </w:p>
+    <w:p>
+      <w:pPr>
+        <w:spacing w:after="10" w:before="10"/>
+        <w:ind w:left="280"/>
+      </w:pPr>
+      <w:r>
+        <w:rPr>
+          <w:rFonts w:ascii="Calibri" w:cs="Calibri" w:eastAsia="Calibri" w:hAnsi="Calibri"/>
+          <w:b/>
+          <w:bCs/>
+          <w:color w:val="888888"/>
+          <w:sz w:val="18"/>
+          <w:szCs w:val="18"/>
+        </w:rPr>
+        <w:t xml:space="preserve">Stack: </w:t>
       </w:r>
       <w:r>
         <w:rPr>
@@ -455,10 +498,204 @@
           <w:i/>
           <w:iCs/>
           <w:color w:val="888888"/>
+          <w:sz w:val="18"/>
+          <w:szCs w:val="18"/>
+        </w:rPr>
+        <w:t xml:space="preserve">InsightFace, MediaPipe, FastAPI, PostgreSQL, Android TWA</w:t>
+      </w:r>
+    </w:p>
+    <w:p>
+      <w:pPr>
+        <w:spacing w:after="20" w:before="20"/>
+        <w:ind w:left="280"/>
+      </w:pPr>
+      <w:r>
+        <w:rPr>
+          <w:rFonts w:ascii="Calibri" w:cs="Calibri" w:eastAsia="Calibri" w:hAnsi="Calibri"/>
+          <w:color w:val="2d6a4f"/>
+          <w:sz w:val="20"/>
+          <w:szCs w:val="20"/>
+        </w:rPr>
+        <w:t xml:space="preserve">•  </w:t>
+      </w:r>
+      <w:r>
+        <w:rPr>
+          <w:rFonts w:ascii="Calibri" w:cs="Calibri" w:eastAsia="Calibri" w:hAnsi="Calibri"/>
+          <w:b/>
+          <w:bCs/>
+          <w:color w:val="1a1a1a"/>
+          <w:sz w:val="20"/>
+          <w:szCs w:val="20"/>
+        </w:rPr>
+        <w:t xml:space="preserve">Provisional patent filed </w:t>
+      </w:r>
+      <w:r>
+        <w:rPr>
+          <w:rFonts w:ascii="Calibri" w:cs="Calibri" w:eastAsia="Calibri" w:hAnsi="Calibri"/>
+          <w:color w:val="333333"/>
+          <w:sz w:val="20"/>
+          <w:szCs w:val="20"/>
+        </w:rPr>
+        <w:t xml:space="preserve">— Pakistan Patent Office, covering the GPS-geofenced biometric attendance method</w:t>
+      </w:r>
+    </w:p>
+    <w:p>
+      <w:pPr>
+        <w:spacing w:after="20" w:before="20"/>
+        <w:ind w:left="280"/>
+      </w:pPr>
+      <w:r>
+        <w:rPr>
+          <w:rFonts w:ascii="Calibri" w:cs="Calibri" w:eastAsia="Calibri" w:hAnsi="Calibri"/>
+          <w:color w:val="2d6a4f"/>
+          <w:sz w:val="20"/>
+          <w:szCs w:val="20"/>
+        </w:rPr>
+        <w:t xml:space="preserve">•  </w:t>
+      </w:r>
+      <w:r>
+        <w:rPr>
+          <w:rFonts w:ascii="Calibri" w:cs="Calibri" w:eastAsia="Calibri" w:hAnsi="Calibri"/>
+          <w:b/>
+          <w:bCs/>
+          <w:color w:val="1a1a1a"/>
+          <w:sz w:val="20"/>
+          <w:szCs w:val="20"/>
+        </w:rPr>
+        <w:t xml:space="preserve">Production system </w:t>
+      </w:r>
+      <w:r>
+        <w:rPr>
+          <w:rFonts w:ascii="Calibri" w:cs="Calibri" w:eastAsia="Calibri" w:hAnsi="Calibri"/>
+          <w:color w:val="333333"/>
+          <w:sz w:val="20"/>
+          <w:szCs w:val="20"/>
+        </w:rPr>
+        <w:t xml:space="preserve">— running in the LGU Mathematics Department for ~400 faculty</w:t>
+      </w:r>
+    </w:p>
+    <w:p>
+      <w:pPr>
+        <w:spacing w:after="20" w:before="20"/>
+        <w:ind w:left="280"/>
+      </w:pPr>
+      <w:r>
+        <w:rPr>
+          <w:rFonts w:ascii="Calibri" w:cs="Calibri" w:eastAsia="Calibri" w:hAnsi="Calibri"/>
+          <w:color w:val="2d6a4f"/>
+          <w:sz w:val="20"/>
+          <w:szCs w:val="20"/>
+        </w:rPr>
+        <w:t xml:space="preserve">•  </w:t>
+      </w:r>
+      <w:r>
+        <w:rPr>
+          <w:rFonts w:ascii="Calibri" w:cs="Calibri" w:eastAsia="Calibri" w:hAnsi="Calibri"/>
+          <w:b/>
+          <w:bCs/>
+          <w:color w:val="1a1a1a"/>
+          <w:sz w:val="20"/>
+          <w:szCs w:val="20"/>
+        </w:rPr>
+        <w:t xml:space="preserve">Recognition engine </w:t>
+      </w:r>
+      <w:r>
+        <w:rPr>
+          <w:rFonts w:ascii="Calibri" w:cs="Calibri" w:eastAsia="Calibri" w:hAnsi="Calibri"/>
+          <w:color w:val="333333"/>
+          <w:sz w:val="20"/>
+          <w:szCs w:val="20"/>
+        </w:rPr>
+        <w:t xml:space="preserve">— InsightFace embeddings with MediaPipe pose-enforced multi-angle enrollment under real campus conditions</w:t>
+      </w:r>
+    </w:p>
+    <w:p>
+      <w:pPr>
+        <w:spacing w:after="20" w:before="20"/>
+        <w:ind w:left="280"/>
+      </w:pPr>
+      <w:r>
+        <w:rPr>
+          <w:rFonts w:ascii="Calibri" w:cs="Calibri" w:eastAsia="Calibri" w:hAnsi="Calibri"/>
+          <w:color w:val="2d6a4f"/>
+          <w:sz w:val="20"/>
+          <w:szCs w:val="20"/>
+        </w:rPr>
+        <w:t xml:space="preserve">•  </w:t>
+      </w:r>
+      <w:r>
+        <w:rPr>
+          <w:rFonts w:ascii="Calibri" w:cs="Calibri" w:eastAsia="Calibri" w:hAnsi="Calibri"/>
+          <w:b/>
+          <w:bCs/>
+          <w:color w:val="1a1a1a"/>
+          <w:sz w:val="20"/>
+          <w:szCs w:val="20"/>
+        </w:rPr>
+        <w:t xml:space="preserve">HOD/Admin dashboards </w:t>
+      </w:r>
+      <w:r>
+        <w:rPr>
+          <w:rFonts w:ascii="Calibri" w:cs="Calibri" w:eastAsia="Calibri" w:hAnsi="Calibri"/>
+          <w:color w:val="333333"/>
+          <w:sz w:val="20"/>
+          <w:szCs w:val="20"/>
+        </w:rPr>
+        <w:t xml:space="preserve">— semester management, per-subject tracking, department analytics, exportable reports</w:t>
+      </w:r>
+    </w:p>
+    <w:p>
+      <w:pPr>
+        <w:spacing w:after="30" w:before="120"/>
+      </w:pPr>
+      <w:r>
+        <w:rPr>
+          <w:rFonts w:ascii="Calibri" w:cs="Calibri" w:eastAsia="Calibri" w:hAnsi="Calibri"/>
+          <w:b/>
+          <w:bCs/>
+          <w:color w:val="1a1a1a"/>
+          <w:sz w:val="21"/>
+          <w:szCs w:val="21"/>
+        </w:rPr>
+        <w:t xml:space="preserve">FlyNet — Connectome-Driven Spiking Neural Network</w:t>
+      </w:r>
+      <w:r>
+        <w:rPr>
+          <w:rFonts w:ascii="Calibri" w:cs="Calibri" w:eastAsia="Calibri" w:hAnsi="Calibri"/>
+          <w:sz w:val="19"/>
+          <w:szCs w:val="19"/>
+        </w:rPr>
+        <w:t xml:space="preserve">   </w:t>
+      </w:r>
+      <w:r>
+        <w:rPr>
+          <w:rFonts w:ascii="Calibri" w:cs="Calibri" w:eastAsia="Calibri" w:hAnsi="Calibri"/>
+          <w:b/>
+          <w:bCs/>
+          <w:color w:val="2d6a4f"/>
+          <w:sz w:val="18"/>
+          <w:szCs w:val="18"/>
+        </w:rPr>
+        <w:t xml:space="preserve">[Live]</w:t>
+      </w:r>
+      <w:r>
+        <w:rPr>
+          <w:rFonts w:ascii="Calibri" w:cs="Calibri" w:eastAsia="Calibri" w:hAnsi="Calibri"/>
+          <w:sz w:val="18"/>
+          <w:szCs w:val="18"/>
+        </w:rPr>
+        <w:t xml:space="preserve">   </w:t>
+      </w:r>
+      <w:r>
+        <w:rPr>
+          <w:rFonts w:ascii="Calibri" w:cs="Calibri" w:eastAsia="Calibri" w:hAnsi="Calibri"/>
+          <w:i/>
+          <w:iCs/>
+          <w:color w:val="888888"/>
           <w:sz w:val="17"/>
           <w:szCs w:val="17"/>
         </w:rPr>
-        <w:t xml:space="preserve">admissions.lgu.edu.pk</w:t>
+        <w:t xml:space="preserve">flyproject.io</w:t>
       </w:r>
     </w:p>
     <w:p>
@@ -486,112 +723,112 @@
           <w:sz w:val="18"/>
           <w:szCs w:val="18"/>
         </w:rPr>
-        <w:t xml:space="preserve">Gemini AI, JavaScript, Voice Mode</w:t>
-      </w:r>
-    </w:p>
-    <w:p>
-      <w:pPr>
-        <w:spacing w:after="20" w:before="20"/>
-        <w:ind w:left="280"/>
-      </w:pPr>
-      <w:r>
-        <w:rPr>
-          <w:rFonts w:ascii="Calibri" w:cs="Calibri" w:eastAsia="Calibri" w:hAnsi="Calibri"/>
-          <w:color w:val="2d6a4f"/>
-          <w:sz w:val="20"/>
-          <w:szCs w:val="20"/>
-        </w:rPr>
-        <w:t xml:space="preserve">•  </w:t>
-      </w:r>
-      <w:r>
-        <w:rPr>
-          <w:rFonts w:ascii="Calibri" w:cs="Calibri" w:eastAsia="Calibri" w:hAnsi="Calibri"/>
-          <w:b/>
-          <w:bCs/>
-          <w:color w:val="1a1a1a"/>
-          <w:sz w:val="20"/>
-          <w:szCs w:val="20"/>
-        </w:rPr>
-        <w:t xml:space="preserve">Gemini-powered chatbot </w:t>
-      </w:r>
-      <w:r>
-        <w:rPr>
-          <w:rFonts w:ascii="Calibri" w:cs="Calibri" w:eastAsia="Calibri" w:hAnsi="Calibri"/>
-          <w:color w:val="333333"/>
-          <w:sz w:val="20"/>
-          <w:szCs w:val="20"/>
-        </w:rPr>
-        <w:t xml:space="preserve">— on official university admissions website, serving thousands of students</w:t>
-      </w:r>
-    </w:p>
-    <w:p>
-      <w:pPr>
-        <w:spacing w:after="20" w:before="20"/>
-        <w:ind w:left="280"/>
-      </w:pPr>
-      <w:r>
-        <w:rPr>
-          <w:rFonts w:ascii="Calibri" w:cs="Calibri" w:eastAsia="Calibri" w:hAnsi="Calibri"/>
-          <w:color w:val="2d6a4f"/>
-          <w:sz w:val="20"/>
-          <w:szCs w:val="20"/>
-        </w:rPr>
-        <w:t xml:space="preserve">•  </w:t>
-      </w:r>
-      <w:r>
-        <w:rPr>
-          <w:rFonts w:ascii="Calibri" w:cs="Calibri" w:eastAsia="Calibri" w:hAnsi="Calibri"/>
-          <w:b/>
-          <w:bCs/>
-          <w:color w:val="1a1a1a"/>
-          <w:sz w:val="20"/>
-          <w:szCs w:val="20"/>
-        </w:rPr>
-        <w:t xml:space="preserve">Floating widget </w:t>
-      </w:r>
-      <w:r>
-        <w:rPr>
-          <w:rFonts w:ascii="Calibri" w:cs="Calibri" w:eastAsia="Calibri" w:hAnsi="Calibri"/>
-          <w:color w:val="333333"/>
-          <w:sz w:val="20"/>
-          <w:szCs w:val="20"/>
-        </w:rPr>
-        <w:t xml:space="preserve">— with dark mode, Urdu support, and voice input/output</w:t>
-      </w:r>
-    </w:p>
-    <w:p>
-      <w:pPr>
-        <w:spacing w:after="20" w:before="20"/>
-        <w:ind w:left="280"/>
-      </w:pPr>
-      <w:r>
-        <w:rPr>
-          <w:rFonts w:ascii="Calibri" w:cs="Calibri" w:eastAsia="Calibri" w:hAnsi="Calibri"/>
-          <w:color w:val="2d6a4f"/>
-          <w:sz w:val="20"/>
-          <w:szCs w:val="20"/>
-        </w:rPr>
-        <w:t xml:space="preserve">•  </w:t>
-      </w:r>
-      <w:r>
-        <w:rPr>
-          <w:rFonts w:ascii="Calibri" w:cs="Calibri" w:eastAsia="Calibri" w:hAnsi="Calibri"/>
-          <w:b/>
-          <w:bCs/>
-          <w:color w:val="1a1a1a"/>
-          <w:sz w:val="20"/>
-          <w:szCs w:val="20"/>
-        </w:rPr>
-        <w:t xml:space="preserve">Quick-reply chips </w:t>
-      </w:r>
-      <w:r>
-        <w:rPr>
-          <w:rFonts w:ascii="Calibri" w:cs="Calibri" w:eastAsia="Calibri" w:hAnsi="Calibri"/>
-          <w:color w:val="333333"/>
-          <w:sz w:val="20"/>
-          <w:szCs w:val="20"/>
-        </w:rPr>
-        <w:t xml:space="preserve">— for fee structure, eligibility, and application process queries</w:t>
+        <w:t xml:space="preserve">PyTorch, SNN, PPO/RL, CUDA, Three.js</w:t>
+      </w:r>
+    </w:p>
+    <w:p>
+      <w:pPr>
+        <w:spacing w:after="20" w:before="20"/>
+        <w:ind w:left="280"/>
+      </w:pPr>
+      <w:r>
+        <w:rPr>
+          <w:rFonts w:ascii="Calibri" w:cs="Calibri" w:eastAsia="Calibri" w:hAnsi="Calibri"/>
+          <w:color w:val="2d6a4f"/>
+          <w:sz w:val="20"/>
+          <w:szCs w:val="20"/>
+        </w:rPr>
+        <w:t xml:space="preserve">•  </w:t>
+      </w:r>
+      <w:r>
+        <w:rPr>
+          <w:rFonts w:ascii="Calibri" w:cs="Calibri" w:eastAsia="Calibri" w:hAnsi="Calibri"/>
+          <w:b/>
+          <w:bCs/>
+          <w:color w:val="1a1a1a"/>
+          <w:sz w:val="20"/>
+          <w:szCs w:val="20"/>
+        </w:rPr>
+        <w:t xml:space="preserve">Real connectome </w:t>
+      </w:r>
+      <w:r>
+        <w:rPr>
+          <w:rFonts w:ascii="Calibri" w:cs="Calibri" w:eastAsia="Calibri" w:hAnsi="Calibri"/>
+          <w:color w:val="333333"/>
+          <w:sz w:val="20"/>
+          <w:szCs w:val="20"/>
+        </w:rPr>
+        <w:t xml:space="preserve">— 1,800 neurons across PB, FB, EB, NO and LAL wired from Drosophila brain data</w:t>
+      </w:r>
+    </w:p>
+    <w:p>
+      <w:pPr>
+        <w:spacing w:after="20" w:before="20"/>
+        <w:ind w:left="280"/>
+      </w:pPr>
+      <w:r>
+        <w:rPr>
+          <w:rFonts w:ascii="Calibri" w:cs="Calibri" w:eastAsia="Calibri" w:hAnsi="Calibri"/>
+          <w:color w:val="2d6a4f"/>
+          <w:sz w:val="20"/>
+          <w:szCs w:val="20"/>
+        </w:rPr>
+        <w:t xml:space="preserve">•  </w:t>
+      </w:r>
+      <w:r>
+        <w:rPr>
+          <w:rFonts w:ascii="Calibri" w:cs="Calibri" w:eastAsia="Calibri" w:hAnsi="Calibri"/>
+          <w:b/>
+          <w:bCs/>
+          <w:color w:val="1a1a1a"/>
+          <w:sz w:val="20"/>
+          <w:szCs w:val="20"/>
+        </w:rPr>
+        <w:t xml:space="preserve">Trained end-to-end </w:t>
+      </w:r>
+      <w:r>
+        <w:rPr>
+          <w:rFonts w:ascii="Calibri" w:cs="Calibri" w:eastAsia="Calibri" w:hAnsi="Calibri"/>
+          <w:color w:val="333333"/>
+          <w:sz w:val="20"/>
+          <w:szCs w:val="20"/>
+        </w:rPr>
+        <w:t xml:space="preserve">— custom spiking architecture optimized with PPO on RTX 5060 (cu126)</w:t>
+      </w:r>
+    </w:p>
+    <w:p>
+      <w:pPr>
+        <w:spacing w:after="20" w:before="20"/>
+        <w:ind w:left="280"/>
+      </w:pPr>
+      <w:r>
+        <w:rPr>
+          <w:rFonts w:ascii="Calibri" w:cs="Calibri" w:eastAsia="Calibri" w:hAnsi="Calibri"/>
+          <w:color w:val="2d6a4f"/>
+          <w:sz w:val="20"/>
+          <w:szCs w:val="20"/>
+        </w:rPr>
+        <w:t xml:space="preserve">•  </w:t>
+      </w:r>
+      <w:r>
+        <w:rPr>
+          <w:rFonts w:ascii="Calibri" w:cs="Calibri" w:eastAsia="Calibri" w:hAnsi="Calibri"/>
+          <w:b/>
+          <w:bCs/>
+          <w:color w:val="1a1a1a"/>
+          <w:sz w:val="20"/>
+          <w:szCs w:val="20"/>
+        </w:rPr>
+        <w:t xml:space="preserve">3D visualization </w:t>
+      </w:r>
+      <w:r>
+        <w:rPr>
+          <w:rFonts w:ascii="Calibri" w:cs="Calibri" w:eastAsia="Calibri" w:hAnsi="Calibri"/>
+          <w:color w:val="333333"/>
+          <w:sz w:val="20"/>
+          <w:szCs w:val="20"/>
+        </w:rPr>
+        <w:t xml:space="preserve">— live brain-activity cascades with vehicle physics and obstacle avoidance</w:t>
       </w:r>
     </w:p>
     <w:p>
@@ -607,7 +844,7 @@
           <w:sz w:val="21"/>
           <w:szCs w:val="21"/>
         </w:rPr>
-        <w:t xml:space="preserve">LGU Gatepass System</w:t>
+        <w:t xml:space="preserve">LGU Admissions Chatbot</w:t>
       </w:r>
       <w:r>
         <w:rPr>
@@ -645,7 +882,7 @@
           <w:sz w:val="17"/>
           <w:szCs w:val="17"/>
         </w:rPr>
-        <w:t xml:space="preserve">lgugatepasss.netlify.app</w:t>
+        <w:t xml:space="preserve">admissions.lgu.edu.pk</w:t>
       </w:r>
     </w:p>
     <w:p>
@@ -673,112 +910,77 @@
           <w:sz w:val="18"/>
           <w:szCs w:val="18"/>
         </w:rPr>
-        <w:t xml:space="preserve">FastAPI, PostgreSQL, Netlify</w:t>
-      </w:r>
-    </w:p>
-    <w:p>
-      <w:pPr>
-        <w:spacing w:after="20" w:before="20"/>
-        <w:ind w:left="280"/>
-      </w:pPr>
-      <w:r>
-        <w:rPr>
-          <w:rFonts w:ascii="Calibri" w:cs="Calibri" w:eastAsia="Calibri" w:hAnsi="Calibri"/>
-          <w:color w:val="2d6a4f"/>
-          <w:sz w:val="20"/>
-          <w:szCs w:val="20"/>
-        </w:rPr>
-        <w:t xml:space="preserve">•  </w:t>
-      </w:r>
-      <w:r>
-        <w:rPr>
-          <w:rFonts w:ascii="Calibri" w:cs="Calibri" w:eastAsia="Calibri" w:hAnsi="Calibri"/>
-          <w:b/>
-          <w:bCs/>
-          <w:color w:val="1a1a1a"/>
-          <w:sz w:val="20"/>
-          <w:szCs w:val="20"/>
-        </w:rPr>
-        <w:t xml:space="preserve">Digital gate-pass system </w:t>
-      </w:r>
-      <w:r>
-        <w:rPr>
-          <w:rFonts w:ascii="Calibri" w:cs="Calibri" w:eastAsia="Calibri" w:hAnsi="Calibri"/>
-          <w:color w:val="333333"/>
-          <w:sz w:val="20"/>
-          <w:szCs w:val="20"/>
-        </w:rPr>
-        <w:t xml:space="preserve">— campus exit verification with multi-step approval workflow</w:t>
-      </w:r>
-    </w:p>
-    <w:p>
-      <w:pPr>
-        <w:spacing w:after="20" w:before="20"/>
-        <w:ind w:left="280"/>
-      </w:pPr>
-      <w:r>
-        <w:rPr>
-          <w:rFonts w:ascii="Calibri" w:cs="Calibri" w:eastAsia="Calibri" w:hAnsi="Calibri"/>
-          <w:color w:val="2d6a4f"/>
-          <w:sz w:val="20"/>
-          <w:szCs w:val="20"/>
-        </w:rPr>
-        <w:t xml:space="preserve">•  </w:t>
-      </w:r>
-      <w:r>
-        <w:rPr>
-          <w:rFonts w:ascii="Calibri" w:cs="Calibri" w:eastAsia="Calibri" w:hAnsi="Calibri"/>
-          <w:b/>
-          <w:bCs/>
-          <w:color w:val="1a1a1a"/>
-          <w:sz w:val="20"/>
-          <w:szCs w:val="20"/>
-        </w:rPr>
-        <w:t xml:space="preserve">Anti-fraud </w:t>
-      </w:r>
-      <w:r>
-        <w:rPr>
-          <w:rFonts w:ascii="Calibri" w:cs="Calibri" w:eastAsia="Calibri" w:hAnsi="Calibri"/>
-          <w:color w:val="333333"/>
-          <w:sz w:val="20"/>
-          <w:szCs w:val="20"/>
-        </w:rPr>
-        <w:t xml:space="preserve">— exit logs require active GPS + face-verified check-in session</w:t>
-      </w:r>
-    </w:p>
-    <w:p>
-      <w:pPr>
-        <w:spacing w:after="20" w:before="20"/>
-        <w:ind w:left="280"/>
-      </w:pPr>
-      <w:r>
-        <w:rPr>
-          <w:rFonts w:ascii="Calibri" w:cs="Calibri" w:eastAsia="Calibri" w:hAnsi="Calibri"/>
-          <w:color w:val="2d6a4f"/>
-          <w:sz w:val="20"/>
-          <w:szCs w:val="20"/>
-        </w:rPr>
-        <w:t xml:space="preserve">•  </w:t>
-      </w:r>
-      <w:r>
-        <w:rPr>
-          <w:rFonts w:ascii="Calibri" w:cs="Calibri" w:eastAsia="Calibri" w:hAnsi="Calibri"/>
-          <w:b/>
-          <w:bCs/>
-          <w:color w:val="1a1a1a"/>
-          <w:sz w:val="20"/>
-          <w:szCs w:val="20"/>
-        </w:rPr>
-        <w:t xml:space="preserve">Full stack solo </w:t>
-      </w:r>
-      <w:r>
-        <w:rPr>
-          <w:rFonts w:ascii="Calibri" w:cs="Calibri" w:eastAsia="Calibri" w:hAnsi="Calibri"/>
-          <w:color w:val="333333"/>
-          <w:sz w:val="20"/>
-          <w:szCs w:val="20"/>
-        </w:rPr>
-        <w:t xml:space="preserve">— — backend, frontend, auth, face verification, admin dashboard</w:t>
+        <w:t xml:space="preserve">Gemini AI, JavaScript, Voice Mode</w:t>
+      </w:r>
+    </w:p>
+    <w:p>
+      <w:pPr>
+        <w:spacing w:after="20" w:before="20"/>
+        <w:ind w:left="280"/>
+      </w:pPr>
+      <w:r>
+        <w:rPr>
+          <w:rFonts w:ascii="Calibri" w:cs="Calibri" w:eastAsia="Calibri" w:hAnsi="Calibri"/>
+          <w:color w:val="2d6a4f"/>
+          <w:sz w:val="20"/>
+          <w:szCs w:val="20"/>
+        </w:rPr>
+        <w:t xml:space="preserve">•  </w:t>
+      </w:r>
+      <w:r>
+        <w:rPr>
+          <w:rFonts w:ascii="Calibri" w:cs="Calibri" w:eastAsia="Calibri" w:hAnsi="Calibri"/>
+          <w:b/>
+          <w:bCs/>
+          <w:color w:val="1a1a1a"/>
+          <w:sz w:val="20"/>
+          <w:szCs w:val="20"/>
+        </w:rPr>
+        <w:t xml:space="preserve">Gemini-powered chatbot </w:t>
+      </w:r>
+      <w:r>
+        <w:rPr>
+          <w:rFonts w:ascii="Calibri" w:cs="Calibri" w:eastAsia="Calibri" w:hAnsi="Calibri"/>
+          <w:color w:val="333333"/>
+          <w:sz w:val="20"/>
+          <w:szCs w:val="20"/>
+        </w:rPr>
+        <w:t xml:space="preserve">— on the official university admissions site, serving thousands of prospective students</w:t>
+      </w:r>
+    </w:p>
+    <w:p>
+      <w:pPr>
+        <w:spacing w:after="20" w:before="20"/>
+        <w:ind w:left="280"/>
+      </w:pPr>
+      <w:r>
+        <w:rPr>
+          <w:rFonts w:ascii="Calibri" w:cs="Calibri" w:eastAsia="Calibri" w:hAnsi="Calibri"/>
+          <w:color w:val="2d6a4f"/>
+          <w:sz w:val="20"/>
+          <w:szCs w:val="20"/>
+        </w:rPr>
+        <w:t xml:space="preserve">•  </w:t>
+      </w:r>
+      <w:r>
+        <w:rPr>
+          <w:rFonts w:ascii="Calibri" w:cs="Calibri" w:eastAsia="Calibri" w:hAnsi="Calibri"/>
+          <w:b/>
+          <w:bCs/>
+          <w:color w:val="1a1a1a"/>
+          <w:sz w:val="20"/>
+          <w:szCs w:val="20"/>
+        </w:rPr>
+        <w:t xml:space="preserve">Floating widget </w:t>
+      </w:r>
+      <w:r>
+        <w:rPr>
+          <w:rFonts w:ascii="Calibri" w:cs="Calibri" w:eastAsia="Calibri" w:hAnsi="Calibri"/>
+          <w:color w:val="333333"/>
+          <w:sz w:val="20"/>
+          <w:szCs w:val="20"/>
+        </w:rPr>
+        <w:t xml:space="preserve">— dark mode, Urdu support, and voice input/output for accessibility</w:t>
       </w:r>
     </w:p>
     <w:p>
@@ -794,7 +996,7 @@
           <w:sz w:val="21"/>
           <w:szCs w:val="21"/>
         </w:rPr>
-        <w:t xml:space="preserve">LGU Assistant — RAG Chatbot</w:t>
+        <w:t xml:space="preserve">OrphanGuard AI — Child Protection Platform</w:t>
       </w:r>
       <w:r>
         <w:rPr>
@@ -815,22 +1017,13 @@
         </w:rPr>
         <w:t xml:space="preserve">[Live]</w:t>
       </w:r>
-    </w:p>
-    <w:p>
-      <w:pPr>
-        <w:spacing w:after="10" w:before="10"/>
-        <w:ind w:left="280"/>
-      </w:pPr>
-      <w:r>
-        <w:rPr>
-          <w:rFonts w:ascii="Calibri" w:cs="Calibri" w:eastAsia="Calibri" w:hAnsi="Calibri"/>
-          <w:b/>
-          <w:bCs/>
-          <w:color w:val="888888"/>
-          <w:sz w:val="18"/>
-          <w:szCs w:val="18"/>
-        </w:rPr>
-        <w:t xml:space="preserve">Stack: </w:t>
+      <w:r>
+        <w:rPr>
+          <w:rFonts w:ascii="Calibri" w:cs="Calibri" w:eastAsia="Calibri" w:hAnsi="Calibri"/>
+          <w:sz w:val="18"/>
+          <w:szCs w:val="18"/>
+        </w:rPr>
+        <w:t xml:space="preserve">   </w:t>
       </w:r>
       <w:r>
         <w:rPr>
@@ -838,115 +1031,143 @@
           <w:i/>
           <w:iCs/>
           <w:color w:val="888888"/>
-          <w:sz w:val="18"/>
-          <w:szCs w:val="18"/>
-        </w:rPr>
-        <w:t xml:space="preserve">FastAPI, ChromaDB, Groq LLM, SentenceTransformers, PWA</w:t>
-      </w:r>
-    </w:p>
-    <w:p>
-      <w:pPr>
-        <w:spacing w:after="20" w:before="20"/>
-        <w:ind w:left="280"/>
-      </w:pPr>
-      <w:r>
-        <w:rPr>
-          <w:rFonts w:ascii="Calibri" w:cs="Calibri" w:eastAsia="Calibri" w:hAnsi="Calibri"/>
-          <w:color w:val="2d6a4f"/>
-          <w:sz w:val="20"/>
-          <w:szCs w:val="20"/>
-        </w:rPr>
-        <w:t xml:space="preserve">•  </w:t>
-      </w:r>
-      <w:r>
-        <w:rPr>
-          <w:rFonts w:ascii="Calibri" w:cs="Calibri" w:eastAsia="Calibri" w:hAnsi="Calibri"/>
-          <w:b/>
-          <w:bCs/>
-          <w:color w:val="1a1a1a"/>
-          <w:sz w:val="20"/>
-          <w:szCs w:val="20"/>
-        </w:rPr>
-        <w:t xml:space="preserve">RAG chatbot </w:t>
-      </w:r>
-      <w:r>
-        <w:rPr>
-          <w:rFonts w:ascii="Calibri" w:cs="Calibri" w:eastAsia="Calibri" w:hAnsi="Calibri"/>
-          <w:color w:val="333333"/>
-          <w:sz w:val="20"/>
-          <w:szCs w:val="20"/>
-        </w:rPr>
-        <w:t xml:space="preserve">— over hundreds of scraped university docs (PDFs, DOCX, web pages)</w:t>
-      </w:r>
-    </w:p>
-    <w:p>
-      <w:pPr>
-        <w:spacing w:after="20" w:before="20"/>
-        <w:ind w:left="280"/>
-      </w:pPr>
-      <w:r>
-        <w:rPr>
-          <w:rFonts w:ascii="Calibri" w:cs="Calibri" w:eastAsia="Calibri" w:hAnsi="Calibri"/>
-          <w:color w:val="2d6a4f"/>
-          <w:sz w:val="20"/>
-          <w:szCs w:val="20"/>
-        </w:rPr>
-        <w:t xml:space="preserve">•  </w:t>
-      </w:r>
-      <w:r>
-        <w:rPr>
-          <w:rFonts w:ascii="Calibri" w:cs="Calibri" w:eastAsia="Calibri" w:hAnsi="Calibri"/>
-          <w:b/>
-          <w:bCs/>
-          <w:color w:val="1a1a1a"/>
-          <w:sz w:val="20"/>
-          <w:szCs w:val="20"/>
-        </w:rPr>
-        <w:t xml:space="preserve">Two-stage retrieval </w:t>
-      </w:r>
-      <w:r>
-        <w:rPr>
-          <w:rFonts w:ascii="Calibri" w:cs="Calibri" w:eastAsia="Calibri" w:hAnsi="Calibri"/>
-          <w:color w:val="333333"/>
-          <w:sz w:val="20"/>
-          <w:szCs w:val="20"/>
-        </w:rPr>
-        <w:t xml:space="preserve">— SentenceTransformer search + CrossEncoder reranking for accurate retrieval</w:t>
-      </w:r>
-    </w:p>
-    <w:p>
-      <w:pPr>
-        <w:spacing w:after="20" w:before="20"/>
-        <w:ind w:left="280"/>
-      </w:pPr>
-      <w:r>
-        <w:rPr>
-          <w:rFonts w:ascii="Calibri" w:cs="Calibri" w:eastAsia="Calibri" w:hAnsi="Calibri"/>
-          <w:color w:val="2d6a4f"/>
-          <w:sz w:val="20"/>
-          <w:szCs w:val="20"/>
-        </w:rPr>
-        <w:t xml:space="preserve">•  </w:t>
-      </w:r>
-      <w:r>
-        <w:rPr>
-          <w:rFonts w:ascii="Calibri" w:cs="Calibri" w:eastAsia="Calibri" w:hAnsi="Calibri"/>
-          <w:b/>
-          <w:bCs/>
-          <w:color w:val="1a1a1a"/>
-          <w:sz w:val="20"/>
-          <w:szCs w:val="20"/>
-        </w:rPr>
-        <w:t xml:space="preserve">Shipped </w:t>
-      </w:r>
-      <w:r>
-        <w:rPr>
-          <w:rFonts w:ascii="Calibri" w:cs="Calibri" w:eastAsia="Calibri" w:hAnsi="Calibri"/>
-          <w:color w:val="333333"/>
-          <w:sz w:val="20"/>
-          <w:szCs w:val="20"/>
-        </w:rPr>
-        <w:t xml:space="preserve">— as installable Android app with Firebase auth and persistent chat history</w:t>
+          <w:sz w:val="17"/>
+          <w:szCs w:val="17"/>
+        </w:rPr>
+        <w:t xml:space="preserve">orphanguard-web-production.up.railway.app</w:t>
+      </w:r>
+    </w:p>
+    <w:p>
+      <w:pPr>
+        <w:spacing w:after="10" w:before="10"/>
+        <w:ind w:left="280"/>
+      </w:pPr>
+      <w:r>
+        <w:rPr>
+          <w:rFonts w:ascii="Calibri" w:cs="Calibri" w:eastAsia="Calibri" w:hAnsi="Calibri"/>
+          <w:b/>
+          <w:bCs/>
+          <w:color w:val="888888"/>
+          <w:sz w:val="18"/>
+          <w:szCs w:val="18"/>
+        </w:rPr>
+        <w:t xml:space="preserve">Stack: </w:t>
+      </w:r>
+      <w:r>
+        <w:rPr>
+          <w:rFonts w:ascii="Calibri" w:cs="Calibri" w:eastAsia="Calibri" w:hAnsi="Calibri"/>
+          <w:i/>
+          <w:iCs/>
+          <w:color w:val="888888"/>
+          <w:sz w:val="18"/>
+          <w:szCs w:val="18"/>
+        </w:rPr>
+        <w:t xml:space="preserve">Node.js, Express, WebSocket, Railway</w:t>
+      </w:r>
+    </w:p>
+    <w:p>
+      <w:pPr>
+        <w:spacing w:after="20" w:before="20"/>
+        <w:ind w:left="280"/>
+      </w:pPr>
+      <w:r>
+        <w:rPr>
+          <w:rFonts w:ascii="Calibri" w:cs="Calibri" w:eastAsia="Calibri" w:hAnsi="Calibri"/>
+          <w:color w:val="2d6a4f"/>
+          <w:sz w:val="20"/>
+          <w:szCs w:val="20"/>
+        </w:rPr>
+        <w:t xml:space="preserve">•  </w:t>
+      </w:r>
+      <w:r>
+        <w:rPr>
+          <w:rFonts w:ascii="Calibri" w:cs="Calibri" w:eastAsia="Calibri" w:hAnsi="Calibri"/>
+          <w:b/>
+          <w:bCs/>
+          <w:color w:val="1a1a1a"/>
+          <w:sz w:val="20"/>
+          <w:szCs w:val="20"/>
+        </w:rPr>
+        <w:t xml:space="preserve">Province-scale model </w:t>
+      </w:r>
+      <w:r>
+        <w:rPr>
+          <w:rFonts w:ascii="Calibri" w:cs="Calibri" w:eastAsia="Calibri" w:hAnsi="Calibri"/>
+          <w:color w:val="333333"/>
+          <w:sz w:val="20"/>
+          <w:szCs w:val="20"/>
+        </w:rPr>
+        <w:t xml:space="preserve">— 85 orphanages across 36 districts, 3,200+ children, 450+ camera feeds</w:t>
+      </w:r>
+    </w:p>
+    <w:p>
+      <w:pPr>
+        <w:spacing w:after="20" w:before="20"/>
+        <w:ind w:left="280"/>
+      </w:pPr>
+      <w:r>
+        <w:rPr>
+          <w:rFonts w:ascii="Calibri" w:cs="Calibri" w:eastAsia="Calibri" w:hAnsi="Calibri"/>
+          <w:color w:val="2d6a4f"/>
+          <w:sz w:val="20"/>
+          <w:szCs w:val="20"/>
+        </w:rPr>
+        <w:t xml:space="preserve">•  </w:t>
+      </w:r>
+      <w:r>
+        <w:rPr>
+          <w:rFonts w:ascii="Calibri" w:cs="Calibri" w:eastAsia="Calibri" w:hAnsi="Calibri"/>
+          <w:b/>
+          <w:bCs/>
+          <w:color w:val="1a1a1a"/>
+          <w:sz w:val="20"/>
+          <w:szCs w:val="20"/>
+        </w:rPr>
+        <w:t xml:space="preserve">Four detection models </w:t>
+      </w:r>
+      <w:r>
+        <w:rPr>
+          <w:rFonts w:ascii="Calibri" w:cs="Calibri" w:eastAsia="Calibri" w:hAnsi="Calibri"/>
+          <w:color w:val="333333"/>
+          <w:sz w:val="20"/>
+          <w:szCs w:val="20"/>
+        </w:rPr>
+        <w:t xml:space="preserve">— violence &amp; harassment, headcount/zone tracking, proximity, and audio</w:t>
+      </w:r>
+    </w:p>
+    <w:p>
+      <w:pPr>
+        <w:spacing w:after="20" w:before="20"/>
+        <w:ind w:left="280"/>
+      </w:pPr>
+      <w:r>
+        <w:rPr>
+          <w:rFonts w:ascii="Calibri" w:cs="Calibri" w:eastAsia="Calibri" w:hAnsi="Calibri"/>
+          <w:color w:val="2d6a4f"/>
+          <w:sz w:val="20"/>
+          <w:szCs w:val="20"/>
+        </w:rPr>
+        <w:t xml:space="preserve">•  </w:t>
+      </w:r>
+      <w:r>
+        <w:rPr>
+          <w:rFonts w:ascii="Calibri" w:cs="Calibri" w:eastAsia="Calibri" w:hAnsi="Calibri"/>
+          <w:b/>
+          <w:bCs/>
+          <w:color w:val="1a1a1a"/>
+          <w:sz w:val="20"/>
+          <w:szCs w:val="20"/>
+        </w:rPr>
+        <w:t xml:space="preserve">Grant pitch </w:t>
+      </w:r>
+      <w:r>
+        <w:rPr>
+          <w:rFonts w:ascii="Calibri" w:cs="Calibri" w:eastAsia="Calibri" w:hAnsi="Calibri"/>
+          <w:color w:val="333333"/>
+          <w:sz w:val="20"/>
+          <w:szCs w:val="20"/>
+        </w:rPr>
+        <w:t xml:space="preserve">— prepared for UNICEF Venture Fund, IGNITE Pakistan, and EU grant programs</w:t>
       </w:r>
     </w:p>
     <w:p>
@@ -962,7 +1183,7 @@
           <w:sz w:val="21"/>
           <w:szCs w:val="21"/>
         </w:rPr>
-        <w:t xml:space="preserve">FaceTrace — Recognition Engine</w:t>
+        <w:t xml:space="preserve">Lahore Smog Dashboard</w:t>
       </w:r>
       <w:r>
         <w:rPr>
@@ -983,22 +1204,13 @@
         </w:rPr>
         <w:t xml:space="preserve">[Live]</w:t>
       </w:r>
-    </w:p>
-    <w:p>
-      <w:pPr>
-        <w:spacing w:after="10" w:before="10"/>
-        <w:ind w:left="280"/>
-      </w:pPr>
-      <w:r>
-        <w:rPr>
-          <w:rFonts w:ascii="Calibri" w:cs="Calibri" w:eastAsia="Calibri" w:hAnsi="Calibri"/>
-          <w:b/>
-          <w:bCs/>
-          <w:color w:val="888888"/>
-          <w:sz w:val="18"/>
-          <w:szCs w:val="18"/>
-        </w:rPr>
-        <w:t xml:space="preserve">Stack: </w:t>
+      <w:r>
+        <w:rPr>
+          <w:rFonts w:ascii="Calibri" w:cs="Calibri" w:eastAsia="Calibri" w:hAnsi="Calibri"/>
+          <w:sz w:val="18"/>
+          <w:szCs w:val="18"/>
+        </w:rPr>
+        <w:t xml:space="preserve">   </w:t>
       </w:r>
       <w:r>
         <w:rPr>
@@ -1006,80 +1218,143 @@
           <w:i/>
           <w:iCs/>
           <w:color w:val="888888"/>
-          <w:sz w:val="18"/>
-          <w:szCs w:val="18"/>
-        </w:rPr>
-        <w:t xml:space="preserve">ArcFace, MTCNN, MediaPipe, FastAPI</w:t>
-      </w:r>
-    </w:p>
-    <w:p>
-      <w:pPr>
-        <w:spacing w:after="20" w:before="20"/>
-        <w:ind w:left="280"/>
-      </w:pPr>
-      <w:r>
-        <w:rPr>
-          <w:rFonts w:ascii="Calibri" w:cs="Calibri" w:eastAsia="Calibri" w:hAnsi="Calibri"/>
-          <w:color w:val="2d6a4f"/>
-          <w:sz w:val="20"/>
-          <w:szCs w:val="20"/>
-        </w:rPr>
-        <w:t xml:space="preserve">•  </w:t>
-      </w:r>
-      <w:r>
-        <w:rPr>
-          <w:rFonts w:ascii="Calibri" w:cs="Calibri" w:eastAsia="Calibri" w:hAnsi="Calibri"/>
-          <w:b/>
-          <w:bCs/>
-          <w:color w:val="1a1a1a"/>
-          <w:sz w:val="20"/>
-          <w:szCs w:val="20"/>
-        </w:rPr>
-        <w:t xml:space="preserve">Face recognition engine </w:t>
-      </w:r>
-      <w:r>
-        <w:rPr>
-          <w:rFonts w:ascii="Calibri" w:cs="Calibri" w:eastAsia="Calibri" w:hAnsi="Calibri"/>
-          <w:color w:val="333333"/>
-          <w:sz w:val="20"/>
-          <w:szCs w:val="20"/>
-        </w:rPr>
-        <w:t xml:space="preserve">— core SDK powering SmartAttend with MediaPipe pose-enforced multi-angle enrollment</w:t>
-      </w:r>
-    </w:p>
-    <w:p>
-      <w:pPr>
-        <w:spacing w:after="20" w:before="20"/>
-        <w:ind w:left="280"/>
-      </w:pPr>
-      <w:r>
-        <w:rPr>
-          <w:rFonts w:ascii="Calibri" w:cs="Calibri" w:eastAsia="Calibri" w:hAnsi="Calibri"/>
-          <w:color w:val="2d6a4f"/>
-          <w:sz w:val="20"/>
-          <w:szCs w:val="20"/>
-        </w:rPr>
-        <w:t xml:space="preserve">•  </w:t>
-      </w:r>
-      <w:r>
-        <w:rPr>
-          <w:rFonts w:ascii="Calibri" w:cs="Calibri" w:eastAsia="Calibri" w:hAnsi="Calibri"/>
-          <w:b/>
-          <w:bCs/>
-          <w:color w:val="1a1a1a"/>
-          <w:sz w:val="20"/>
-          <w:szCs w:val="20"/>
-        </w:rPr>
-        <w:t xml:space="preserve">Live math demo </w:t>
-      </w:r>
-      <w:r>
-        <w:rPr>
-          <w:rFonts w:ascii="Calibri" w:cs="Calibri" w:eastAsia="Calibri" w:hAnsi="Calibri"/>
-          <w:color w:val="333333"/>
-          <w:sz w:val="20"/>
-          <w:szCs w:val="20"/>
-        </w:rPr>
-        <w:t xml:space="preserve">— with real-time embedding visualization and similarity scoring</w:t>
+          <w:sz w:val="17"/>
+          <w:szCs w:val="17"/>
+        </w:rPr>
+        <w:t xml:space="preserve">luminous-vibrancy-production.up.railway.app</w:t>
+      </w:r>
+    </w:p>
+    <w:p>
+      <w:pPr>
+        <w:spacing w:after="10" w:before="10"/>
+        <w:ind w:left="280"/>
+      </w:pPr>
+      <w:r>
+        <w:rPr>
+          <w:rFonts w:ascii="Calibri" w:cs="Calibri" w:eastAsia="Calibri" w:hAnsi="Calibri"/>
+          <w:b/>
+          <w:bCs/>
+          <w:color w:val="888888"/>
+          <w:sz w:val="18"/>
+          <w:szCs w:val="18"/>
+        </w:rPr>
+        <w:t xml:space="preserve">Stack: </w:t>
+      </w:r>
+      <w:r>
+        <w:rPr>
+          <w:rFonts w:ascii="Calibri" w:cs="Calibri" w:eastAsia="Calibri" w:hAnsi="Calibri"/>
+          <w:i/>
+          <w:iCs/>
+          <w:color w:val="888888"/>
+          <w:sz w:val="18"/>
+          <w:szCs w:val="18"/>
+        </w:rPr>
+        <w:t xml:space="preserve">Python, WAQI API, Railway</w:t>
+      </w:r>
+    </w:p>
+    <w:p>
+      <w:pPr>
+        <w:spacing w:after="20" w:before="20"/>
+        <w:ind w:left="280"/>
+      </w:pPr>
+      <w:r>
+        <w:rPr>
+          <w:rFonts w:ascii="Calibri" w:cs="Calibri" w:eastAsia="Calibri" w:hAnsi="Calibri"/>
+          <w:color w:val="2d6a4f"/>
+          <w:sz w:val="20"/>
+          <w:szCs w:val="20"/>
+        </w:rPr>
+        <w:t xml:space="preserve">•  </w:t>
+      </w:r>
+      <w:r>
+        <w:rPr>
+          <w:rFonts w:ascii="Calibri" w:cs="Calibri" w:eastAsia="Calibri" w:hAnsi="Calibri"/>
+          <w:b/>
+          <w:bCs/>
+          <w:color w:val="1a1a1a"/>
+          <w:sz w:val="20"/>
+          <w:szCs w:val="20"/>
+        </w:rPr>
+        <w:t xml:space="preserve">Built for 14 stakeholders </w:t>
+      </w:r>
+      <w:r>
+        <w:rPr>
+          <w:rFonts w:ascii="Calibri" w:cs="Calibri" w:eastAsia="Calibri" w:hAnsi="Calibri"/>
+          <w:color w:val="333333"/>
+          <w:sz w:val="20"/>
+          <w:szCs w:val="20"/>
+        </w:rPr>
+        <w:t xml:space="preserve">— government and NGO representatives from an LGU smog session</w:t>
+      </w:r>
+    </w:p>
+    <w:p>
+      <w:pPr>
+        <w:spacing w:after="20" w:before="20"/>
+        <w:ind w:left="280"/>
+      </w:pPr>
+      <w:r>
+        <w:rPr>
+          <w:rFonts w:ascii="Calibri" w:cs="Calibri" w:eastAsia="Calibri" w:hAnsi="Calibri"/>
+          <w:color w:val="2d6a4f"/>
+          <w:sz w:val="20"/>
+          <w:szCs w:val="20"/>
+        </w:rPr>
+        <w:t xml:space="preserve">•  </w:t>
+      </w:r>
+      <w:r>
+        <w:rPr>
+          <w:rFonts w:ascii="Calibri" w:cs="Calibri" w:eastAsia="Calibri" w:hAnsi="Calibri"/>
+          <w:b/>
+          <w:bCs/>
+          <w:color w:val="1a1a1a"/>
+          <w:sz w:val="20"/>
+          <w:szCs w:val="20"/>
+        </w:rPr>
+        <w:t xml:space="preserve">EPA AQI inversion </w:t>
+      </w:r>
+      <w:r>
+        <w:rPr>
+          <w:rFonts w:ascii="Calibri" w:cs="Calibri" w:eastAsia="Calibri" w:hAnsi="Calibri"/>
+          <w:color w:val="333333"/>
+          <w:sz w:val="20"/>
+          <w:szCs w:val="20"/>
+        </w:rPr>
+        <w:t xml:space="preserve">— recovers true concentrations from WAQI sub-indices, which overstate exposure if read directly</w:t>
+      </w:r>
+    </w:p>
+    <w:p>
+      <w:pPr>
+        <w:spacing w:after="20" w:before="20"/>
+        <w:ind w:left="280"/>
+      </w:pPr>
+      <w:r>
+        <w:rPr>
+          <w:rFonts w:ascii="Calibri" w:cs="Calibri" w:eastAsia="Calibri" w:hAnsi="Calibri"/>
+          <w:color w:val="2d6a4f"/>
+          <w:sz w:val="20"/>
+          <w:szCs w:val="20"/>
+        </w:rPr>
+        <w:t xml:space="preserve">•  </w:t>
+      </w:r>
+      <w:r>
+        <w:rPr>
+          <w:rFonts w:ascii="Calibri" w:cs="Calibri" w:eastAsia="Calibri" w:hAnsi="Calibri"/>
+          <w:b/>
+          <w:bCs/>
+          <w:color w:val="1a1a1a"/>
+          <w:sz w:val="20"/>
+          <w:szCs w:val="20"/>
+        </w:rPr>
+        <w:t xml:space="preserve">Department-addressed output </w:t>
+      </w:r>
+      <w:r>
+        <w:rPr>
+          <w:rFonts w:ascii="Calibri" w:cs="Calibri" w:eastAsia="Calibri" w:hAnsi="Calibri"/>
+          <w:color w:val="333333"/>
+          <w:sz w:val="20"/>
+          <w:szCs w:val="20"/>
+        </w:rPr>
+        <w:t xml:space="preserve">— 3-hour forecast, threshold alerts, and shareable PNG snapshots</w:t>
       </w:r>
     </w:p>
     <w:p>
@@ -1095,7 +1370,7 @@
           <w:sz w:val="21"/>
           <w:szCs w:val="21"/>
         </w:rPr>
-        <w:t xml:space="preserve">ClassMind — AI Study Assistant</w:t>
+        <w:t xml:space="preserve">LGU Assistant — RAG Chatbot</w:t>
       </w:r>
       <w:r>
         <w:rPr>
@@ -1142,6 +1417,174 @@
           <w:sz w:val="18"/>
           <w:szCs w:val="18"/>
         </w:rPr>
+        <w:t xml:space="preserve">FastAPI, ChromaDB, Groq LLM, SentenceTransformers, PWA</w:t>
+      </w:r>
+    </w:p>
+    <w:p>
+      <w:pPr>
+        <w:spacing w:after="20" w:before="20"/>
+        <w:ind w:left="280"/>
+      </w:pPr>
+      <w:r>
+        <w:rPr>
+          <w:rFonts w:ascii="Calibri" w:cs="Calibri" w:eastAsia="Calibri" w:hAnsi="Calibri"/>
+          <w:color w:val="2d6a4f"/>
+          <w:sz w:val="20"/>
+          <w:szCs w:val="20"/>
+        </w:rPr>
+        <w:t xml:space="preserve">•  </w:t>
+      </w:r>
+      <w:r>
+        <w:rPr>
+          <w:rFonts w:ascii="Calibri" w:cs="Calibri" w:eastAsia="Calibri" w:hAnsi="Calibri"/>
+          <w:b/>
+          <w:bCs/>
+          <w:color w:val="1a1a1a"/>
+          <w:sz w:val="20"/>
+          <w:szCs w:val="20"/>
+        </w:rPr>
+        <w:t xml:space="preserve">RAG chatbot </w:t>
+      </w:r>
+      <w:r>
+        <w:rPr>
+          <w:rFonts w:ascii="Calibri" w:cs="Calibri" w:eastAsia="Calibri" w:hAnsi="Calibri"/>
+          <w:color w:val="333333"/>
+          <w:sz w:val="20"/>
+          <w:szCs w:val="20"/>
+        </w:rPr>
+        <w:t xml:space="preserve">— over hundreds of scraped university docs (PDFs, DOCX, web pages)</w:t>
+      </w:r>
+    </w:p>
+    <w:p>
+      <w:pPr>
+        <w:spacing w:after="20" w:before="20"/>
+        <w:ind w:left="280"/>
+      </w:pPr>
+      <w:r>
+        <w:rPr>
+          <w:rFonts w:ascii="Calibri" w:cs="Calibri" w:eastAsia="Calibri" w:hAnsi="Calibri"/>
+          <w:color w:val="2d6a4f"/>
+          <w:sz w:val="20"/>
+          <w:szCs w:val="20"/>
+        </w:rPr>
+        <w:t xml:space="preserve">•  </w:t>
+      </w:r>
+      <w:r>
+        <w:rPr>
+          <w:rFonts w:ascii="Calibri" w:cs="Calibri" w:eastAsia="Calibri" w:hAnsi="Calibri"/>
+          <w:b/>
+          <w:bCs/>
+          <w:color w:val="1a1a1a"/>
+          <w:sz w:val="20"/>
+          <w:szCs w:val="20"/>
+        </w:rPr>
+        <w:t xml:space="preserve">Two-stage retrieval </w:t>
+      </w:r>
+      <w:r>
+        <w:rPr>
+          <w:rFonts w:ascii="Calibri" w:cs="Calibri" w:eastAsia="Calibri" w:hAnsi="Calibri"/>
+          <w:color w:val="333333"/>
+          <w:sz w:val="20"/>
+          <w:szCs w:val="20"/>
+        </w:rPr>
+        <w:t xml:space="preserve">— SentenceTransformer search plus CrossEncoder reranking for accurate context</w:t>
+      </w:r>
+    </w:p>
+    <w:p>
+      <w:pPr>
+        <w:spacing w:after="20" w:before="20"/>
+        <w:ind w:left="280"/>
+      </w:pPr>
+      <w:r>
+        <w:rPr>
+          <w:rFonts w:ascii="Calibri" w:cs="Calibri" w:eastAsia="Calibri" w:hAnsi="Calibri"/>
+          <w:color w:val="2d6a4f"/>
+          <w:sz w:val="20"/>
+          <w:szCs w:val="20"/>
+        </w:rPr>
+        <w:t xml:space="preserve">•  </w:t>
+      </w:r>
+      <w:r>
+        <w:rPr>
+          <w:rFonts w:ascii="Calibri" w:cs="Calibri" w:eastAsia="Calibri" w:hAnsi="Calibri"/>
+          <w:b/>
+          <w:bCs/>
+          <w:color w:val="1a1a1a"/>
+          <w:sz w:val="20"/>
+          <w:szCs w:val="20"/>
+        </w:rPr>
+        <w:t xml:space="preserve">Shipped </w:t>
+      </w:r>
+      <w:r>
+        <w:rPr>
+          <w:rFonts w:ascii="Calibri" w:cs="Calibri" w:eastAsia="Calibri" w:hAnsi="Calibri"/>
+          <w:color w:val="333333"/>
+          <w:sz w:val="20"/>
+          <w:szCs w:val="20"/>
+        </w:rPr>
+        <w:t xml:space="preserve">— installable Android app with Firebase auth and persistent chat history</w:t>
+      </w:r>
+    </w:p>
+    <w:p>
+      <w:pPr>
+        <w:spacing w:after="30" w:before="120"/>
+      </w:pPr>
+      <w:r>
+        <w:rPr>
+          <w:rFonts w:ascii="Calibri" w:cs="Calibri" w:eastAsia="Calibri" w:hAnsi="Calibri"/>
+          <w:b/>
+          <w:bCs/>
+          <w:color w:val="1a1a1a"/>
+          <w:sz w:val="21"/>
+          <w:szCs w:val="21"/>
+        </w:rPr>
+        <w:t xml:space="preserve">ClassMind — AI Study Assistant</w:t>
+      </w:r>
+      <w:r>
+        <w:rPr>
+          <w:rFonts w:ascii="Calibri" w:cs="Calibri" w:eastAsia="Calibri" w:hAnsi="Calibri"/>
+          <w:sz w:val="19"/>
+          <w:szCs w:val="19"/>
+        </w:rPr>
+        <w:t xml:space="preserve">   </w:t>
+      </w:r>
+      <w:r>
+        <w:rPr>
+          <w:rFonts w:ascii="Calibri" w:cs="Calibri" w:eastAsia="Calibri" w:hAnsi="Calibri"/>
+          <w:b/>
+          <w:bCs/>
+          <w:color w:val="2d6a4f"/>
+          <w:sz w:val="18"/>
+          <w:szCs w:val="18"/>
+        </w:rPr>
+        <w:t xml:space="preserve">[Live]</w:t>
+      </w:r>
+    </w:p>
+    <w:p>
+      <w:pPr>
+        <w:spacing w:after="10" w:before="10"/>
+        <w:ind w:left="280"/>
+      </w:pPr>
+      <w:r>
+        <w:rPr>
+          <w:rFonts w:ascii="Calibri" w:cs="Calibri" w:eastAsia="Calibri" w:hAnsi="Calibri"/>
+          <w:b/>
+          <w:bCs/>
+          <w:color w:val="888888"/>
+          <w:sz w:val="18"/>
+          <w:szCs w:val="18"/>
+        </w:rPr>
+        <w:t xml:space="preserve">Stack: </w:t>
+      </w:r>
+      <w:r>
+        <w:rPr>
+          <w:rFonts w:ascii="Calibri" w:cs="Calibri" w:eastAsia="Calibri" w:hAnsi="Calibri"/>
+          <w:i/>
+          <w:iCs/>
+          <w:color w:val="888888"/>
+          <w:sz w:val="18"/>
+          <w:szCs w:val="18"/>
+        </w:rPr>
         <w:t xml:space="preserve">Groq Llama-3.3, SQLite Vector, Telegram Bot, Railway</w:t>
       </w:r>
     </w:p>
@@ -1212,42 +1655,7 @@
           <w:sz w:val="20"/>
           <w:szCs w:val="20"/>
         </w:rPr>
-        <w:t xml:space="preserve">— with cosine-similarity search, no external vector DB needed</w:t>
-      </w:r>
-    </w:p>
-    <w:p>
-      <w:pPr>
-        <w:spacing w:after="20" w:before="20"/>
-        <w:ind w:left="280"/>
-      </w:pPr>
-      <w:r>
-        <w:rPr>
-          <w:rFonts w:ascii="Calibri" w:cs="Calibri" w:eastAsia="Calibri" w:hAnsi="Calibri"/>
-          <w:color w:val="2d6a4f"/>
-          <w:sz w:val="20"/>
-          <w:szCs w:val="20"/>
-        </w:rPr>
-        <w:t xml:space="preserve">•  </w:t>
-      </w:r>
-      <w:r>
-        <w:rPr>
-          <w:rFonts w:ascii="Calibri" w:cs="Calibri" w:eastAsia="Calibri" w:hAnsi="Calibri"/>
-          <w:b/>
-          <w:bCs/>
-          <w:color w:val="1a1a1a"/>
-          <w:sz w:val="20"/>
-          <w:szCs w:val="20"/>
-        </w:rPr>
-        <w:t xml:space="preserve">Deployed on Railway </w:t>
-      </w:r>
-      <w:r>
-        <w:rPr>
-          <w:rFonts w:ascii="Calibri" w:cs="Calibri" w:eastAsia="Calibri" w:hAnsi="Calibri"/>
-          <w:color w:val="333333"/>
-          <w:sz w:val="20"/>
-          <w:szCs w:val="20"/>
-        </w:rPr>
-        <w:t xml:space="preserve">— — zero-install access for students via Telegram</w:t>
+        <w:t xml:space="preserve">— cosine-similarity search with no external vector DB dependency</w:t>
       </w:r>
     </w:p>
     <w:p>
@@ -1296,7 +1704,7 @@
           <w:sz w:val="20"/>
           <w:szCs w:val="20"/>
         </w:rPr>
-        <w:t xml:space="preserve">   Lahore Garrison University  ·  2025 – Present  ·  2nd Semester</w:t>
+        <w:t xml:space="preserve">   Lahore Garrison University  ·  2025 – Present  ·  3rd Semester</w:t>
       </w:r>
     </w:p>
     <w:p>

</xml_diff>